<commit_message>
update doc files and .gitignore
</commit_message>
<xml_diff>
--- a/Docs/Naming Conventions.docx
+++ b/Docs/Naming Conventions.docx
@@ -162,7 +162,25 @@
           <w:bCs/>
           <w:szCs w:val="24"/>
         </w:rPr>
-        <w:t>Staging Layer</w:t>
+        <w:t>Staging</w:t>
+      </w:r>
+      <w:r>
+        <w:rPr>
+          <w:rFonts w:eastAsia="Times New Roman" w:cs="Times New Roman"/>
+          <w:b/>
+          <w:bCs/>
+          <w:szCs w:val="24"/>
+        </w:rPr>
+        <w:t>/Bronze</w:t>
+      </w:r>
+      <w:r>
+        <w:rPr>
+          <w:rFonts w:eastAsia="Times New Roman" w:cs="Times New Roman"/>
+          <w:b/>
+          <w:bCs/>
+          <w:szCs w:val="24"/>
+        </w:rPr>
+        <w:t xml:space="preserve"> Layer</w:t>
       </w:r>
     </w:p>
     <w:p>
@@ -589,7 +607,6 @@
           <w:rFonts w:eastAsia="Times New Roman" w:cs="Times New Roman"/>
           <w:szCs w:val="24"/>
         </w:rPr>
-        <w:lastRenderedPageBreak/>
         <w:t>System-generated or technical metadata columns must start with the prefix “</w:t>
       </w:r>
       <w:proofErr w:type="spellStart"/>
@@ -669,6 +686,7 @@
           <w:sz w:val="27"/>
           <w:szCs w:val="27"/>
         </w:rPr>
+        <w:lastRenderedPageBreak/>
         <w:t>Stored Procedure Naming</w:t>
       </w:r>
     </w:p>

</xml_diff>

<commit_message>
Updating repo with finished bronze extraction/transforming/loading scripts, modified docs, and SQL bronze schema scripts.
</commit_message>
<xml_diff>
--- a/Docs/Naming Conventions.docx
+++ b/Docs/Naming Conventions.docx
@@ -65,23 +65,7 @@
           <w:rFonts w:eastAsia="Times New Roman" w:cs="Times New Roman"/>
           <w:szCs w:val="24"/>
         </w:rPr>
-        <w:t xml:space="preserve">Use </w:t>
-      </w:r>
-      <w:proofErr w:type="spellStart"/>
-      <w:r>
-        <w:rPr>
-          <w:rFonts w:eastAsia="Times New Roman" w:cs="Times New Roman"/>
-          <w:szCs w:val="24"/>
-        </w:rPr>
-        <w:t>snake_case</w:t>
-      </w:r>
-      <w:proofErr w:type="spellEnd"/>
-      <w:r>
-        <w:rPr>
-          <w:rFonts w:eastAsia="Times New Roman" w:cs="Times New Roman"/>
-          <w:szCs w:val="24"/>
-        </w:rPr>
-        <w:t xml:space="preserve"> for all object names.</w:t>
+        <w:t>Use snake_case for all object names.</w:t>
       </w:r>
     </w:p>
     <w:p>
@@ -262,21 +246,33 @@
         </w:rPr>
         <w:t>Example: “</w:t>
       </w:r>
-      <w:proofErr w:type="spellStart"/>
-      <w:r>
-        <w:rPr>
-          <w:rFonts w:eastAsia="Times New Roman" w:cs="Times New Roman"/>
-          <w:szCs w:val="24"/>
-        </w:rPr>
-        <w:t>noaa_alerts</w:t>
-      </w:r>
-      <w:proofErr w:type="spellEnd"/>
-      <w:r>
-        <w:rPr>
-          <w:rFonts w:eastAsia="Times New Roman" w:cs="Times New Roman"/>
-          <w:szCs w:val="24"/>
-        </w:rPr>
-        <w:t>” represents weather alerts from the NOAA API.</w:t>
+      <w:r>
+        <w:rPr>
+          <w:rFonts w:eastAsia="Times New Roman" w:cs="Times New Roman"/>
+          <w:szCs w:val="24"/>
+        </w:rPr>
+        <w:t>openweather</w:t>
+      </w:r>
+      <w:r>
+        <w:rPr>
+          <w:rFonts w:eastAsia="Times New Roman" w:cs="Times New Roman"/>
+          <w:szCs w:val="24"/>
+        </w:rPr>
+        <w:t xml:space="preserve">_alerts” represents weather alerts from the </w:t>
+      </w:r>
+      <w:r>
+        <w:rPr>
+          <w:rFonts w:eastAsia="Times New Roman" w:cs="Times New Roman"/>
+          <w:szCs w:val="24"/>
+        </w:rPr>
+        <w:t>OpenWeather</w:t>
+      </w:r>
+      <w:r>
+        <w:rPr>
+          <w:rFonts w:eastAsia="Times New Roman" w:cs="Times New Roman"/>
+          <w:szCs w:val="24"/>
+        </w:rPr>
+        <w:t xml:space="preserve"> API.</w:t>
       </w:r>
     </w:p>
     <w:p>
@@ -374,23 +370,7 @@
           <w:rFonts w:eastAsia="Times New Roman" w:cs="Times New Roman"/>
           <w:szCs w:val="24"/>
         </w:rPr>
-        <w:t>Example: “</w:t>
-      </w:r>
-      <w:proofErr w:type="spellStart"/>
-      <w:r>
-        <w:rPr>
-          <w:rFonts w:eastAsia="Times New Roman" w:cs="Times New Roman"/>
-          <w:szCs w:val="24"/>
-        </w:rPr>
-        <w:t>openweather_conditions</w:t>
-      </w:r>
-      <w:proofErr w:type="spellEnd"/>
-      <w:r>
-        <w:rPr>
-          <w:rFonts w:eastAsia="Times New Roman" w:cs="Times New Roman"/>
-          <w:szCs w:val="24"/>
-        </w:rPr>
-        <w:t>” represents cleaned weather condition data from OpenWeather.</w:t>
+        <w:t>Example: “openweather_conditions” represents cleaned weather condition data from OpenWeather.</w:t>
       </w:r>
     </w:p>
     <w:p>
@@ -488,39 +468,7 @@
           <w:rFonts w:eastAsia="Times New Roman" w:cs="Times New Roman"/>
           <w:szCs w:val="24"/>
         </w:rPr>
-        <w:t>Example: “</w:t>
-      </w:r>
-      <w:proofErr w:type="spellStart"/>
-      <w:r>
-        <w:rPr>
-          <w:rFonts w:eastAsia="Times New Roman" w:cs="Times New Roman"/>
-          <w:szCs w:val="24"/>
-        </w:rPr>
-        <w:t>dim_alerts</w:t>
-      </w:r>
-      <w:proofErr w:type="spellEnd"/>
-      <w:r>
-        <w:rPr>
-          <w:rFonts w:eastAsia="Times New Roman" w:cs="Times New Roman"/>
-          <w:szCs w:val="24"/>
-        </w:rPr>
-        <w:t>” stores descriptive information about alert categories, while “</w:t>
-      </w:r>
-      <w:proofErr w:type="spellStart"/>
-      <w:r>
-        <w:rPr>
-          <w:rFonts w:eastAsia="Times New Roman" w:cs="Times New Roman"/>
-          <w:szCs w:val="24"/>
-        </w:rPr>
-        <w:t>fact_conditions</w:t>
-      </w:r>
-      <w:proofErr w:type="spellEnd"/>
-      <w:r>
-        <w:rPr>
-          <w:rFonts w:eastAsia="Times New Roman" w:cs="Times New Roman"/>
-          <w:szCs w:val="24"/>
-        </w:rPr>
-        <w:t>” stores daily condition facts.</w:t>
+        <w:t>Example: “dim_alerts” stores descriptive information about alert categories, while “fact_conditions” stores daily condition facts.</w:t>
       </w:r>
     </w:p>
     <w:p>
@@ -571,23 +519,7 @@
           <w:szCs w:val="24"/>
         </w:rPr>
         <w:br/>
-        <w:t>Example: “</w:t>
-      </w:r>
-      <w:proofErr w:type="spellStart"/>
-      <w:r>
-        <w:rPr>
-          <w:rFonts w:eastAsia="Times New Roman" w:cs="Times New Roman"/>
-          <w:szCs w:val="24"/>
-        </w:rPr>
-        <w:t>dim_alerts_key</w:t>
-      </w:r>
-      <w:proofErr w:type="spellEnd"/>
-      <w:r>
-        <w:rPr>
-          <w:rFonts w:eastAsia="Times New Roman" w:cs="Times New Roman"/>
-          <w:szCs w:val="24"/>
-        </w:rPr>
-        <w:t>.”</w:t>
+        <w:t>Example: “dim_alerts_key.”</w:t>
       </w:r>
     </w:p>
     <w:p>
@@ -607,23 +539,7 @@
           <w:rFonts w:eastAsia="Times New Roman" w:cs="Times New Roman"/>
           <w:szCs w:val="24"/>
         </w:rPr>
-        <w:t>System-generated or technical metadata columns must start with the prefix “</w:t>
-      </w:r>
-      <w:proofErr w:type="spellStart"/>
-      <w:r>
-        <w:rPr>
-          <w:rFonts w:eastAsia="Times New Roman" w:cs="Times New Roman"/>
-          <w:szCs w:val="24"/>
-        </w:rPr>
-        <w:t>dwh</w:t>
-      </w:r>
-      <w:proofErr w:type="spellEnd"/>
-      <w:r>
-        <w:rPr>
-          <w:rFonts w:eastAsia="Times New Roman" w:cs="Times New Roman"/>
-          <w:szCs w:val="24"/>
-        </w:rPr>
-        <w:t>_,” followed by a descriptive term that explains the column’s function.</w:t>
+        <w:t>System-generated or technical metadata columns must start with the prefix “dwh_,” followed by a descriptive term that explains the column’s function.</w:t>
       </w:r>
       <w:r>
         <w:rPr>
@@ -631,39 +547,7 @@
           <w:szCs w:val="24"/>
         </w:rPr>
         <w:br/>
-        <w:t>Examples: “</w:t>
-      </w:r>
-      <w:proofErr w:type="spellStart"/>
-      <w:r>
-        <w:rPr>
-          <w:rFonts w:eastAsia="Times New Roman" w:cs="Times New Roman"/>
-          <w:szCs w:val="24"/>
-        </w:rPr>
-        <w:t>dwh_created_at</w:t>
-      </w:r>
-      <w:proofErr w:type="spellEnd"/>
-      <w:r>
-        <w:rPr>
-          <w:rFonts w:eastAsia="Times New Roman" w:cs="Times New Roman"/>
-          <w:szCs w:val="24"/>
-        </w:rPr>
-        <w:t>,” “</w:t>
-      </w:r>
-      <w:proofErr w:type="spellStart"/>
-      <w:r>
-        <w:rPr>
-          <w:rFonts w:eastAsia="Times New Roman" w:cs="Times New Roman"/>
-          <w:szCs w:val="24"/>
-        </w:rPr>
-        <w:t>dwh_last_updated</w:t>
-      </w:r>
-      <w:proofErr w:type="spellEnd"/>
-      <w:r>
-        <w:rPr>
-          <w:rFonts w:eastAsia="Times New Roman" w:cs="Times New Roman"/>
-          <w:szCs w:val="24"/>
-        </w:rPr>
-        <w:t>.”</w:t>
+        <w:t>Examples: “dwh_created_at,” “dwh_last_updated.”</w:t>
       </w:r>
     </w:p>
     <w:p>
@@ -747,39 +631,7 @@
           <w:rFonts w:eastAsia="Times New Roman" w:cs="Times New Roman"/>
           <w:szCs w:val="24"/>
         </w:rPr>
-        <w:t>Examples: “</w:t>
-      </w:r>
-      <w:proofErr w:type="spellStart"/>
-      <w:r>
-        <w:rPr>
-          <w:rFonts w:eastAsia="Times New Roman" w:cs="Times New Roman"/>
-          <w:szCs w:val="24"/>
-        </w:rPr>
-        <w:t>load_noaa_staging</w:t>
-      </w:r>
-      <w:proofErr w:type="spellEnd"/>
-      <w:r>
-        <w:rPr>
-          <w:rFonts w:eastAsia="Times New Roman" w:cs="Times New Roman"/>
-          <w:szCs w:val="24"/>
-        </w:rPr>
-        <w:t>,” “</w:t>
-      </w:r>
-      <w:proofErr w:type="spellStart"/>
-      <w:r>
-        <w:rPr>
-          <w:rFonts w:eastAsia="Times New Roman" w:cs="Times New Roman"/>
-          <w:szCs w:val="24"/>
-        </w:rPr>
-        <w:t>load_openweather_silver</w:t>
-      </w:r>
-      <w:proofErr w:type="spellEnd"/>
-      <w:r>
-        <w:rPr>
-          <w:rFonts w:eastAsia="Times New Roman" w:cs="Times New Roman"/>
-          <w:szCs w:val="24"/>
-        </w:rPr>
-        <w:t>.”</w:t>
+        <w:t>Examples: “load_noaa_staging,” “load_openweather_silver.”</w:t>
       </w:r>
     </w:p>
     <w:p/>

</xml_diff>